<commit_message>
Manuel malagasy T5 : lohahevitra 5 (vahoaka sy mpitondra) + nettoyages 3 et 4
- data_loha5.py : fandraisana anjara amin'ny resaka iombonana (dihy), lahatsoratra « Fivoriana ao
  amin'ny tanàna », fomba fiteny raikitra sy « mifamp- » / « fifamp- », lahatsoratra fampahafantarana
- sources.py : wiki_demokrasia (2 passages verbatim, sans date)
- thèmes 3 et 4 : tiret « — » initial retiré des listes (déjà ajouté par le gabarit), blancs de
  complétition jamais suivis de « . » ni de « , »
- README : 4 points de plus dans la checklist du format compact (pièges rencontrés)
- build + verify : 5 thèmes = 20 fiches, tous TUATUA (217 invariants pour 4 et 5)

Co-authored-by: arena-agent <297053741+arena-agent@users.noreply.github.com>
</commit_message>
<xml_diff>
--- a/manuel-malagasy-t5/output/Manuel_Malagasy_T5_Loha3_V1.docx
+++ b/manuel-malagasy-t5/output/Manuel_Malagasy_T5_Loha3_V1.docx
@@ -3565,7 +3565,7 @@
           <w:color w:val="000000"/>
           <w:sz w:val="22"/>
         </w:rPr>
-        <w:t xml:space="preserve">— — Diso : « Ny ala dia tsy ilaina. » — Marina : « Ny ala dia ilaina, </w:t>
+        <w:t xml:space="preserve">— Diso : « Ny ala dia tsy ilaina. » — Marina : « Ny ala dia ilaina, </w:t>
       </w:r>
       <w:r>
         <w:rPr>
@@ -3600,7 +3600,7 @@
           <w:color w:val="000000"/>
           <w:sz w:val="22"/>
         </w:rPr>
-        <w:t xml:space="preserve">— — Diso : « Mba lanity ! » (tsy misy teny mpandamina) — Marina : « </w:t>
+        <w:t xml:space="preserve">— Diso : « Mba lanity ! » (tsy misy teny mpandamina) — Marina : « </w:t>
       </w:r>
       <w:r>
         <w:rPr>
@@ -3635,7 +3635,7 @@
           <w:color w:val="000000"/>
           <w:sz w:val="22"/>
         </w:rPr>
-        <w:t xml:space="preserve">— — Diso : « rehefa maina ny renirano, dia … » (tsy vita) — Marina : « </w:t>
+        <w:t xml:space="preserve">— Diso : « rehefa maina ny renirano, dia … » (tsy vita) — Marina : « </w:t>
       </w:r>
       <w:r>
         <w:rPr>
@@ -11634,7 +11634,7 @@
           <w:color w:val="000000"/>
           <w:sz w:val="22"/>
         </w:rPr>
-        <w:t xml:space="preserve">— — Diso : « Ny zavatra </w:t>
+        <w:t xml:space="preserve">— Diso : « Ny zavatra </w:t>
       </w:r>
       <w:r>
         <w:rPr>
@@ -11688,7 +11688,7 @@
           <w:color w:val="000000"/>
           <w:sz w:val="22"/>
         </w:rPr>
-        <w:t xml:space="preserve">— — Diso : « </w:t>
+        <w:t xml:space="preserve">— Diso : « </w:t>
       </w:r>
       <w:r>
         <w:rPr>
@@ -11742,7 +11742,7 @@
           <w:color w:val="000000"/>
           <w:sz w:val="22"/>
         </w:rPr>
-        <w:t xml:space="preserve">— — Diso : « Ny ala sy ny tany fambolen-tsakafo vaovao dia renifameno. » — Marina : « Ny ala dia </w:t>
+        <w:t xml:space="preserve">— Diso : « Ny ala sy ny tany fambolen-tsakafo vaovao dia renifameno. » — Marina : « Ny ala dia </w:t>
       </w:r>
       <w:r>
         <w:rPr>
@@ -15328,7 +15328,7 @@
           <w:color w:val="000000"/>
           <w:sz w:val="22"/>
         </w:rPr>
-        <w:t xml:space="preserve">— — Diso : « Ny fako maina, mando ary loto dia zavatra samy hafa. » (hevitro : maro karazana) — Marina : « … zavatra </w:t>
+        <w:t xml:space="preserve">— Diso : « Ny fako maina, mando ary loto dia zavatra samy hafa. » (hevitro : maro karazana) — Marina : « … zavatra </w:t>
       </w:r>
       <w:r>
         <w:rPr>
@@ -15363,7 +15363,7 @@
           <w:color w:val="000000"/>
           <w:sz w:val="22"/>
         </w:rPr>
-        <w:t xml:space="preserve">— — Diso : « misy karatra fizarana ho an ny kilasy » — Marina : « … ho </w:t>
+        <w:t xml:space="preserve">— Diso : « misy karatra fizarana ho an ny kilasy » — Marina : « … ho </w:t>
       </w:r>
       <w:r>
         <w:rPr>
@@ -15398,7 +15398,7 @@
           <w:color w:val="000000"/>
           <w:sz w:val="22"/>
         </w:rPr>
-        <w:t xml:space="preserve">— — Diso : Lahatsoratra tsy misy teboka eo amin'ny faran'ny fehezanteny — Marina : </w:t>
+        <w:t xml:space="preserve">— Diso : Lahatsoratra tsy misy teboka eo amin'ny faran'ny fehezanteny — Marina : </w:t>
       </w:r>
       <w:r>
         <w:rPr>

</xml_diff>